<commit_message>
feat(emails): quitar correo al Comite por cada carga de anteproyecto
Antes, cada vez que un equipo de caso/PI cargaba el anteproyecto, el
sistema disparaba 3 correos: al director, al Comite y a los miembros
del equipo. Para una cohorte de 60 personas el Comite recibe 20+
correos, lo cual es spam.

A partir de ahora:
- POR CADA CARGA: solo correo al director + correo a los miembros del
  equipo. El Comite NO recibe nada.
- A futuro (pendiente): cuando el super_admin revise y apruebe la
  sabana de caso/PI, se enviara UN solo correo consolidado al Comite
  con el listado de todos los equipos. Endpoint admin separado.

docs/Emails_Sistema_NAVES.docx regenerado (ahora 6 correos en lugar
de 7).

Co-Authored-By: Claude Opus 4.7 (1M context) <noreply@anthropic.com>
</commit_message>
<xml_diff>
--- a/docs/Emails_Sistema_NAVES.docx
+++ b/docs/Emails_Sistema_NAVES.docx
@@ -22,7 +22,7 @@
     </w:p>
     <w:p>
       <w:r>
-        <w:t>Este documento lista los siete correos automáticos que envía la plataforma. Para cada uno se incluye el destinatario, el disparador, el asunto y el cuerpo actual. Sirve de base para revisar el copy y proponer ajustes.</w:t>
+        <w:t>Este documento lista los seis correos automáticos que envía la plataforma. Para cada uno se incluye el destinatario, el disparador, el asunto y el cuerpo actual. Sirve de base para revisar el copy y proponer ajustes. El correo al Comité del MBA por cada carga de anteproyecto fue retirado: el Comité recibirá un único correo consolidado cuando el super_admin revise y apruebe la sábana de caso/PI (pendiente de implementar).</w:t>
       </w:r>
     </w:p>
     <w:p>
@@ -189,7 +189,7 @@
           </w:tcPr>
           <w:p>
             <w:r>
-              <w:t>Anteproyecto al director</w:t>
+              <w:t>Anteproyecto al director (caso/PI)</w:t>
             </w:r>
           </w:p>
         </w:tc>
@@ -221,7 +221,7 @@
           </w:tcPr>
           <w:p>
             <w:r>
-              <w:t>Anteproyecto al Comité</w:t>
+              <w:t>Confirmación a participantes (caso/PI)</w:t>
             </w:r>
           </w:p>
         </w:tc>
@@ -244,38 +244,6 @@
           <w:p>
             <w:r>
               <w:t>6</w:t>
-            </w:r>
-          </w:p>
-        </w:tc>
-        <w:tc>
-          <w:tcPr>
-            <w:tcW w:type="dxa" w:w="3249"/>
-          </w:tcPr>
-          <w:p>
-            <w:r>
-              <w:t>Confirmación a participantes (caso/PI)</w:t>
-            </w:r>
-          </w:p>
-        </w:tc>
-        <w:tc>
-          <w:tcPr>
-            <w:tcW w:type="dxa" w:w="3249"/>
-          </w:tcPr>
-          <w:p>
-            <w:r>
-              <w:t>ACTUALIZADO</w:t>
-            </w:r>
-          </w:p>
-        </w:tc>
-      </w:tr>
-      <w:tr>
-        <w:tc>
-          <w:tcPr>
-            <w:tcW w:type="dxa" w:w="3249"/>
-          </w:tcPr>
-          <w:p>
-            <w:r>
-              <w:t>7</w:t>
             </w:r>
           </w:p>
         </w:tc>
@@ -746,124 +714,7 @@
         <w:pStyle w:val="Heading1"/>
       </w:pPr>
       <w:r>
-        <w:t>5. Nuevo anteproyecto cargado — {equipo} ({modalidad})</w:t>
-      </w:r>
-    </w:p>
-    <w:p>
-      <w:r>
-        <w:rPr>
-          <w:b/>
-        </w:rPr>
-        <w:t xml:space="preserve">Destinatario: </w:t>
-      </w:r>
-      <w:r>
-        <w:t>Comité del MBA (susana.jaime@inalde.edu.co).</w:t>
-      </w:r>
-      <w:r>
-        <w:rPr>
-          <w:b/>
-        </w:rPr>
-        <w:br/>
-        <w:t xml:space="preserve">Disparador: </w:t>
-      </w:r>
-      <w:r>
-        <w:t>Mismo instante que el correo al director.</w:t>
-      </w:r>
-      <w:r>
-        <w:rPr>
-          <w:b/>
-        </w:rPr>
-        <w:br/>
-        <w:t xml:space="preserve">Asunto: </w:t>
-      </w:r>
-      <w:r>
-        <w:t>Nuevo anteproyecto cargado — {equipo} ({modalidad})</w:t>
-      </w:r>
-      <w:r>
-        <w:rPr>
-          <w:b/>
-        </w:rPr>
-        <w:br/>
-        <w:t xml:space="preserve">Archivo: </w:t>
-      </w:r>
-      <w:r>
-        <w:t>backend/src/routes/trabajos-grado.ts (líneas 189-214)</w:t>
-      </w:r>
-      <w:r>
-        <w:rPr>
-          <w:b/>
-        </w:rPr>
-        <w:br/>
-        <w:t xml:space="preserve">Estado: </w:t>
-      </w:r>
-      <w:r>
-        <w:t>ACTUALIZADO con el nuevo tono institucional.</w:t>
-      </w:r>
-    </w:p>
-    <w:p>
-      <w:pPr>
-        <w:pStyle w:val="Heading2"/>
-      </w:pPr>
-      <w:r>
-        <w:t>Cuerpo</w:t>
-      </w:r>
-    </w:p>
-    <w:p>
-      <w:r>
-        <w:t>NOTIFICACIÓN INTERNA — PROGRAMA MBA</w:t>
-      </w:r>
-    </w:p>
-    <w:p>
-      <w:r>
-        <w:t>Nuevo anteproyecto cargado al sistema</w:t>
-      </w:r>
-    </w:p>
-    <w:p/>
-    <w:p>
-      <w:r>
-        <w:t>Reciba un cordial saludo. Le informamos que se cargó un nuevo anteproyecto en el sistema de trabajos de grado del MBA. A continuación se relacionan los detalles. {línea adjunto}</w:t>
-      </w:r>
-    </w:p>
-    <w:p/>
-    <w:p>
-      <w:r>
-        <w:t>Equipo · Miembros · Modalidad · Cohorte · Dirección asignada · Cargado por · Fecha de carga</w:t>
-      </w:r>
-    </w:p>
-    <w:p/>
-    <w:p>
-      <w:r>
-        <w:t>Atentamente,</w:t>
-      </w:r>
-    </w:p>
-    <w:p>
-      <w:r>
-        <w:t>Programa MBA — INALDE Business School</w:t>
-      </w:r>
-    </w:p>
-    <w:p>
-      <w:pPr>
-        <w:pStyle w:val="Heading2"/>
-      </w:pPr>
-      <w:r>
-        <w:t>Notas / variantes</w:t>
-      </w:r>
-    </w:p>
-    <w:p>
-      <w:pPr>
-        <w:pStyle w:val="ListBullet"/>
-      </w:pPr>
-      <w:r>
-        <w:t>Línea adjunto (sin adjunto): «No fue posible adjuntar el documento al presente correo (falla técnica al recuperarlo del almacenamiento). El archivo sigue disponible en la plataforma, en el detalle del anteproyecto correspondiente.»</w:t>
-      </w:r>
-    </w:p>
-    <w:p/>
-    <w:p>
-      <w:pPr>
-        <w:pStyle w:val="Heading1"/>
-      </w:pPr>
-      <w:r>
-        <w:t>6. Confirmación de carga del anteproyecto — MBA INALDE</w:t>
+        <w:t>5. Confirmación de carga del anteproyecto — MBA INALDE</w:t>
       </w:r>
     </w:p>
     <w:p>
@@ -999,7 +850,7 @@
         <w:pStyle w:val="Heading1"/>
       </w:pPr>
       <w:r>
-        <w:t>7. Confirmación de envío del anteproyecto — MBA INALDE</w:t>
+        <w:t>6. Confirmación de envío del anteproyecto — MBA INALDE</w:t>
       </w:r>
     </w:p>
     <w:p>

</xml_diff>

<commit_message>
feat(emails): unificar confirmacion a participantes para las 3 modalidades
Antes habia dos templates distintos:
- #6 'Confirmacion de carga' para caso/PI (al subir el PDF).
- #7 'Confirmacion de envio' para BP (al pulsar 'Enviar definitivo').
Eran practicamente lo mismo: 'tu equipo registro el anteproyecto'.

Ahora:
- Nuevo helper services/notificaciones-anteproyecto.ts con UN solo
  template (Confirmacion de registro -- Programa MBA / 'El anteproyecto
  de su equipo fue registrado').
- La fila 'Direccion asignada' y la linea sobre el adjunto solo
  aparecen cuando se pasa el bloque casoPI; para BP el correo es el
  mismo template sin esos detalles.
- Asunto: 'Confirmacion de registro del anteproyecto -- {equipo}'.
- Las dos rutas (POST upload caso/PI y POST enviar BP) llaman al
  mismo helper.

docs/Emails_Sistema_NAVES.docx pasa de 6 a 5 correos.

Co-Authored-By: Claude Opus 4.7 (1M context) <noreply@anthropic.com>
</commit_message>
<xml_diff>
--- a/docs/Emails_Sistema_NAVES.docx
+++ b/docs/Emails_Sistema_NAVES.docx
@@ -22,7 +22,7 @@
     </w:p>
     <w:p>
       <w:r>
-        <w:t>Este documento lista los seis correos automáticos que envía la plataforma. Para cada uno se incluye el destinatario, el disparador, el asunto y el cuerpo actual. Sirve de base para revisar el copy y proponer ajustes. El correo al Comité del MBA por cada carga de anteproyecto fue retirado: el Comité recibirá un único correo consolidado cuando el super_admin revise y apruebe la sábana de caso/PI (pendiente de implementar).</w:t>
+        <w:t>Este documento lista los cinco correos automáticos que envía la plataforma. Para cada uno se incluye el destinatario, el disparador, el asunto y el cuerpo actual. Sirve de base para revisar el copy y proponer ajustes. El correo al Comité del MBA por cada carga de anteproyecto fue retirado: el Comité recibirá un único correo consolidado cuando el super_admin revise y apruebe la sábana de caso/PI (pendiente de implementar). La confirmación de registro a participantes se unificó en un solo template para las tres modalidades (BP, Caso, PI).</w:t>
       </w:r>
     </w:p>
     <w:p>
@@ -221,7 +221,7 @@
           </w:tcPr>
           <w:p>
             <w:r>
-              <w:t>Confirmación a participantes (caso/PI)</w:t>
+              <w:t>Registro del anteproyecto a participantes</w:t>
             </w:r>
           </w:p>
         </w:tc>
@@ -231,39 +231,7 @@
           </w:tcPr>
           <w:p>
             <w:r>
-              <w:t>ACTUALIZADO</w:t>
-            </w:r>
-          </w:p>
-        </w:tc>
-      </w:tr>
-      <w:tr>
-        <w:tc>
-          <w:tcPr>
-            <w:tcW w:type="dxa" w:w="3249"/>
-          </w:tcPr>
-          <w:p>
-            <w:r>
-              <w:t>6</w:t>
-            </w:r>
-          </w:p>
-        </w:tc>
-        <w:tc>
-          <w:tcPr>
-            <w:tcW w:type="dxa" w:w="3249"/>
-          </w:tcPr>
-          <w:p>
-            <w:r>
-              <w:t>Envío definitivo (BP)</w:t>
-            </w:r>
-          </w:p>
-        </w:tc>
-        <w:tc>
-          <w:tcPr>
-            <w:tcW w:type="dxa" w:w="3249"/>
-          </w:tcPr>
-          <w:p>
-            <w:r>
-              <w:t>ACTUALIZADO al tono nuevo</w:t>
+              <w:t>UNIFICADO — un solo template para BP, Caso y PI</w:t>
             </w:r>
           </w:p>
         </w:tc>
@@ -714,7 +682,7 @@
         <w:pStyle w:val="Heading1"/>
       </w:pPr>
       <w:r>
-        <w:t>5. Confirmación de carga del anteproyecto — MBA INALDE</w:t>
+        <w:t>5. Confirmación de registro del anteproyecto — {equipo}</w:t>
       </w:r>
     </w:p>
     <w:p>
@@ -725,7 +693,7 @@
         <w:t xml:space="preserve">Destinatario: </w:t>
       </w:r>
       <w:r>
-        <w:t>Todos los miembros del equipo (Caso / Proyecto de Investigación).</w:t>
+        <w:t>Todos los miembros del equipo (cualquier modalidad: Business Plan, Caso o Proyecto de Investigación).</w:t>
       </w:r>
       <w:r>
         <w:rPr>
@@ -735,7 +703,7 @@
         <w:t xml:space="preserve">Disparador: </w:t>
       </w:r>
       <w:r>
-        <w:t>Mismo instante que los anteriores (uno por miembro).</w:t>
+        <w:t>Para Caso/PI: al cargar el PDF del anteproyecto en la plataforma. Para Business Plan: al pulsar «Enviar definitivo» en el formulario (estado pasa de borrador → enviado).</w:t>
       </w:r>
       <w:r>
         <w:rPr>
@@ -745,7 +713,7 @@
         <w:t xml:space="preserve">Asunto: </w:t>
       </w:r>
       <w:r>
-        <w:t>Confirmación de carga del anteproyecto — MBA INALDE</w:t>
+        <w:t>Confirmación de registro del anteproyecto — {equipoNombre}</w:t>
       </w:r>
       <w:r>
         <w:rPr>
@@ -755,7 +723,7 @@
         <w:t xml:space="preserve">Archivo: </w:t>
       </w:r>
       <w:r>
-        <w:t>backend/src/routes/trabajos-grado.ts (líneas 215-252)</w:t>
+        <w:t>backend/src/services/notificaciones-anteproyecto.ts (helper compartido)</w:t>
       </w:r>
       <w:r>
         <w:rPr>
@@ -765,7 +733,7 @@
         <w:t xml:space="preserve">Estado: </w:t>
       </w:r>
       <w:r>
-        <w:t>ACTUALIZADO con el nuevo tono institucional.</w:t>
+        <w:t>UNIFICADO — un solo template para las tres modalidades. La fila «Dirección asignada» y la línea sobre el adjunto solo aparecen en Caso/PI.</w:t>
       </w:r>
     </w:p>
     <w:p>
@@ -778,12 +746,12 @@
     </w:p>
     <w:p>
       <w:r>
-        <w:t>CONFIRMACIÓN DE CARGA — PROGRAMA MBA</w:t>
+        <w:t>CONFIRMACIÓN DE REGISTRO — PROGRAMA MBA</w:t>
       </w:r>
     </w:p>
     <w:p>
       <w:r>
-        <w:t>El anteproyecto de su equipo fue cargado</w:t>
+        <w:t>El anteproyecto de su equipo fue registrado</w:t>
       </w:r>
     </w:p>
     <w:p/>
@@ -794,19 +762,19 @@
     </w:p>
     <w:p>
       <w:r>
-        <w:t>Reciba un cordial saludo. Le confirmamos que el anteproyecto del equipo {equipo} fue cargado en el sistema de trabajos de grado del MBA por {cargador}. {línea adjunto}</w:t>
+        <w:t>Reciba un cordial saludo. Le confirmamos que el anteproyecto del equipo {equipo} fue registrado en el sistema de trabajos de grado del MBA [por {cargador}]. [línea adjunto solo en Caso/PI]</w:t>
       </w:r>
     </w:p>
     <w:p/>
     <w:p>
       <w:r>
-        <w:t>Equipo · Miembros · Modalidad · Cohorte · Dirección asignada · Fecha de carga</w:t>
+        <w:t>Equipo · Miembros · Modalidad · Cohorte · [Dirección asignada — solo Caso/PI] · Fecha y hora</w:t>
       </w:r>
     </w:p>
     <w:p/>
     <w:p>
       <w:r>
-        <w:t>El anteproyecto queda registrado de manera definitiva y no podrá ser reemplazado. Una vez la dirección revise el documento y se cumpla la fecha establecida en el cronograma, podrán cargar el proyecto final desde la plataforma.</w:t>
+        <w:t>El anteproyecto queda registrado de manera definitiva y no podrá ser reemplazado. Una vez se cumpla la fecha establecida en el cronograma, podrán continuar con la siguiente etapa del trabajo de grado desde la plataforma.</w:t>
       </w:r>
     </w:p>
     <w:p/>
@@ -833,7 +801,7 @@
         <w:pStyle w:val="ListBullet"/>
       </w:pPr>
       <w:r>
-        <w:t>Línea adjunto (con adjunto): «El director(a), {director}, ya fue notificado(a) por correo electrónico y recibió el documento como archivo adjunto.»</w:t>
+        <w:t>Línea adjunto (Caso/PI con adjunto): «La dirección asignada, a cargo de {director}, ya fue notificada por correo electrónico y recibió el documento como archivo adjunto.»</w:t>
       </w:r>
     </w:p>
     <w:p>
@@ -841,119 +809,15 @@
         <w:pStyle w:val="ListBullet"/>
       </w:pPr>
       <w:r>
-        <w:t>Línea adjunto (sin adjunto): «Se notificó al director(a), {director}, sobre la carga; sin embargo, por una falla técnica no fue posible adjuntar el documento al correo. Te pedimos hacerle llegar el documento directamente por correo para que pueda revisarlo.»</w:t>
-      </w:r>
-    </w:p>
-    <w:p/>
-    <w:p>
-      <w:pPr>
-        <w:pStyle w:val="Heading1"/>
-      </w:pPr>
-      <w:r>
-        <w:t>6. Confirmación de envío del anteproyecto — MBA INALDE</w:t>
-      </w:r>
-    </w:p>
-    <w:p>
-      <w:r>
-        <w:rPr>
-          <w:b/>
-        </w:rPr>
-        <w:t xml:space="preserve">Destinatario: </w:t>
-      </w:r>
-      <w:r>
-        <w:t>Todos los miembros del equipo Business Plan.</w:t>
-      </w:r>
-      <w:r>
-        <w:rPr>
-          <w:b/>
-        </w:rPr>
-        <w:br/>
-        <w:t xml:space="preserve">Disparador: </w:t>
-      </w:r>
-      <w:r>
-        <w:t>Al pulsar «Enviar definitivo» en el formulario BP (estado pasa de borrador → enviado).</w:t>
-      </w:r>
-      <w:r>
-        <w:rPr>
-          <w:b/>
-        </w:rPr>
-        <w:br/>
-        <w:t xml:space="preserve">Asunto: </w:t>
-      </w:r>
-      <w:r>
-        <w:t>Confirmación de envío del anteproyecto — MBA INALDE</w:t>
-      </w:r>
-      <w:r>
-        <w:rPr>
-          <w:b/>
-        </w:rPr>
-        <w:br/>
-        <w:t xml:space="preserve">Archivo: </w:t>
-      </w:r>
-      <w:r>
-        <w:t>backend/src/routes/anteproyectos.ts (líneas 50-72)</w:t>
-      </w:r>
-      <w:r>
-        <w:rPr>
-          <w:b/>
-        </w:rPr>
-        <w:br/>
-        <w:t xml:space="preserve">Estado: </w:t>
-      </w:r>
-      <w:r>
-        <w:t>ACTUALIZADO con el nuevo tono institucional y lenguaje neutral.</w:t>
+        <w:t>Línea adjunto (Caso/PI sin adjunto): «Se notificó a la dirección asignada, a cargo de {director}, sobre la carga; sin embargo, por una falla técnica no fue posible adjuntar el documento al correo. Le pedimos hacerle llegar el documento directamente por correo para que pueda revisarlo.»</w:t>
       </w:r>
     </w:p>
     <w:p>
       <w:pPr>
-        <w:pStyle w:val="Heading2"/>
+        <w:pStyle w:val="ListBullet"/>
       </w:pPr>
       <w:r>
-        <w:t>Cuerpo</w:t>
-      </w:r>
-    </w:p>
-    <w:p>
-      <w:r>
-        <w:t>CONFIRMACIÓN DE ENVÍO — PROGRAMA MBA</w:t>
-      </w:r>
-    </w:p>
-    <w:p>
-      <w:r>
-        <w:t>El anteproyecto de su equipo fue enviado</w:t>
-      </w:r>
-    </w:p>
-    <w:p/>
-    <w:p>
-      <w:r>
-        <w:t>{Miembro}:</w:t>
-      </w:r>
-    </w:p>
-    <w:p>
-      <w:r>
-        <w:t>Reciba un cordial saludo. Le confirmamos que el anteproyecto de su equipo fue enviado al Programa MBA de INALDE Business School.</w:t>
-      </w:r>
-    </w:p>
-    <w:p/>
-    <w:p>
-      <w:r>
-        <w:t>Equipo · Cohorte · Modalidad · Fecha y hora</w:t>
-      </w:r>
-    </w:p>
-    <w:p/>
-    <w:p>
-      <w:r>
-        <w:t>A partir de este momento el anteproyecto queda bloqueado para edición. Si requiere algún ajuste, por favor comuníquelo a la asistente del programa.</w:t>
-      </w:r>
-    </w:p>
-    <w:p/>
-    <w:p>
-      <w:r>
-        <w:t>Cordialmente,</w:t>
-      </w:r>
-    </w:p>
-    <w:p>
-      <w:r>
-        <w:t>Programa MBA — INALDE Business School</w:t>
+        <w:t>Para Business Plan: no aplica la línea de adjunto ni la fila «Dirección asignada» (el flujo BP no tiene director sino profesor que se asigna después).</w:t>
       </w:r>
     </w:p>
     <w:p/>

</xml_diff>